<commit_message>
Critical-review revision: matched-composition LiRA headline, scoped claims, per-class table, configuration-level explanation statistics (D59)
Co-Authored-By: Claude Opus 5.5 <noreply@anthropic.com>
Claude-Session: https://claude.ai/code/session_01GmqQpV3GfnfDawN9ZdytqY
</commit_message>
<xml_diff>
--- a/paper/submission/cover_letter.docx
+++ b/paper/submission/cover_letter.docx
@@ -103,7 +103,7 @@
         <w:t xml:space="preserve"> </w:t>
       </w:r>
       <w:r>
-        <w:t xml:space="preserve">Record-level differential privacy at</w:t>
+        <w:t xml:space="preserve">In federated models, record-level differential privacy at</w:t>
       </w:r>
       <w:r>
         <w:t xml:space="preserve"> </w:t>
@@ -126,13 +126,19 @@
         <w:t xml:space="preserve"> </w:t>
       </w:r>
       <w:r>
-        <w:t xml:space="preserve">kept a likelihood-ratio membership attack at chance for a</w:t>
-      </w:r>
-      <w:r>
-        <w:t xml:space="preserve"> </w:t>
-      </w:r>
-      <w:r>
-        <w:t xml:space="preserve">balanced-accuracy cost of 0.076 in federated and 0.130 in central training, whereas a per-patient guarantee needed</w:t>
+        <w:t xml:space="preserve">left a likelihood-ratio membership attack</w:t>
+      </w:r>
+      <w:r>
+        <w:t xml:space="preserve"> </w:t>
+      </w:r>
+      <w:r>
+        <w:t xml:space="preserve">with no rate significantly above chance once members and non-members were matched in source and class, for a</w:t>
+      </w:r>
+      <w:r>
+        <w:t xml:space="preserve"> </w:t>
+      </w:r>
+      <w:r>
+        <w:t xml:space="preserve">balanced-accuracy cost of 0.076, against 0.130 in central training, whereas a per-patient guarantee needed</w:t>
       </w:r>
       <w:r>
         <w:t xml:space="preserve"> </w:t>
@@ -164,7 +170,13 @@
         <w:t xml:space="preserve"> </w:t>
       </w:r>
       <w:r>
-        <w:t xml:space="preserve">declined with privacy in step with accuracy.</w:t>
+        <w:t xml:space="preserve">declined with privacy in step with accuracy, and the accuracy lost under privacy fell mainly on meningioma and</w:t>
+      </w:r>
+      <w:r>
+        <w:t xml:space="preserve"> </w:t>
+      </w:r>
+      <w:r>
+        <w:t xml:space="preserve">no-tumour sensitivity.</w:t>
       </w:r>
     </w:p>
     <w:p>

</xml_diff>

<commit_message>
Cover letter regenerated with current findings and blank suggested-reviewer table
Co-Authored-By: Claude Opus 5.5 <noreply@anthropic.com>
Claude-Session: https://claude.ai/code/session_01GmqQpV3GfnfDawN9ZdytqY
</commit_message>
<xml_diff>
--- a/paper/submission/cover_letter.docx
+++ b/paper/submission/cover_letter.docx
@@ -19,7 +19,7 @@
         <w:br/>
       </w:r>
       <w:r>
-        <w:t xml:space="preserve">[CHECK: date of submission]</w:t>
+        <w:t xml:space="preserve">23 October 2026</w:t>
       </w:r>
     </w:p>
     <w:p>
@@ -85,25 +85,31 @@
         <w:pStyle w:val="BodyText"/>
       </w:pPr>
       <w:r>
-        <w:t xml:space="preserve">The manuscript addresses a question that affects any multi-hospital artificial intelligence model in neuro-oncology,</w:t>
-      </w:r>
-      <w:r>
-        <w:t xml:space="preserve"> </w:t>
-      </w:r>
-      <w:r>
-        <w:t xml:space="preserve">namely what a formal privacy guarantee costs and what it actually protects. On a deduplicated three-source brain</w:t>
-      </w:r>
-      <w:r>
-        <w:t xml:space="preserve"> </w:t>
-      </w:r>
-      <w:r>
-        <w:t xml:space="preserve">tumour MRI benchmark, a mirror-aware check found 66 contaminated test images that perceptual hashing had missed.</w:t>
-      </w:r>
-      <w:r>
-        <w:t xml:space="preserve"> </w:t>
-      </w:r>
-      <w:r>
-        <w:t xml:space="preserve">In federated models, record-level differential privacy at</w:t>
+        <w:t xml:space="preserve">Multi-hospital artificial intelligence for neuro-oncology needs formal privacy guarantees, yet published federated</w:t>
+      </w:r>
+      <w:r>
+        <w:t xml:space="preserve"> </w:t>
+      </w:r>
+      <w:r>
+        <w:t xml:space="preserve">brain tumour classifiers rarely state an accounted budget or the protected unit, and their public benchmarks overlap.</w:t>
+      </w:r>
+      <w:r>
+        <w:t xml:space="preserve"> </w:t>
+      </w:r>
+      <w:r>
+        <w:t xml:space="preserve">The manuscript measures what accounted differential privacy costs and what it protects. On a deduplicated</w:t>
+      </w:r>
+      <w:r>
+        <w:t xml:space="preserve"> </w:t>
+      </w:r>
+      <w:r>
+        <w:t xml:space="preserve">three-source benchmark, a mirror-aware check found 66 test images with near-copies in other splits that perceptual</w:t>
+      </w:r>
+      <w:r>
+        <w:t xml:space="preserve"> </w:t>
+      </w:r>
+      <w:r>
+        <w:t xml:space="preserve">hashing had missed. Record-level differential privacy at</w:t>
       </w:r>
       <w:r>
         <w:t xml:space="preserve"> </w:t>
@@ -126,19 +132,19 @@
         <w:t xml:space="preserve"> </w:t>
       </w:r>
       <w:r>
-        <w:t xml:space="preserve">left a likelihood-ratio membership attack</w:t>
-      </w:r>
-      <w:r>
-        <w:t xml:space="preserve"> </w:t>
-      </w:r>
-      <w:r>
-        <w:t xml:space="preserve">with no rate significantly above chance once members and non-members were matched in source and class, for a</w:t>
-      </w:r>
-      <w:r>
-        <w:t xml:space="preserve"> </w:t>
-      </w:r>
-      <w:r>
-        <w:t xml:space="preserve">balanced-accuracy cost of 0.076, against 0.130 in central training, whereas a per-patient guarantee needed</w:t>
+        <w:t xml:space="preserve">cost 0.076 in balanced accuracy for federated</w:t>
+      </w:r>
+      <w:r>
+        <w:t xml:space="preserve"> </w:t>
+      </w:r>
+      <w:r>
+        <w:t xml:space="preserve">and 0.130 for central training, mainly through meningioma and no-tumour sensitivity, whereas a per-patient guarantee</w:t>
+      </w:r>
+      <w:r>
+        <w:t xml:space="preserve"> </w:t>
+      </w:r>
+      <w:r>
+        <w:t xml:space="preserve">needed</w:t>
       </w:r>
       <w:r>
         <w:t xml:space="preserve"> </w:t>
@@ -158,25 +164,25 @@
         </m:r>
       </m:oMath>
       <w:r>
-        <w:t xml:space="preserve">. Without privacy the same attack separated training from test patients with an AUC of 0.805, and an</w:t>
-      </w:r>
-      <w:r>
-        <w:t xml:space="preserve"> </w:t>
-      </w:r>
-      <w:r>
-        <w:t xml:space="preserve">unclipped noise mechanism used in prior work still exposed patients. Grad-CAM localisation and cross-seed consistency</w:t>
-      </w:r>
-      <w:r>
-        <w:t xml:space="preserve"> </w:t>
-      </w:r>
-      <w:r>
-        <w:t xml:space="preserve">declined with privacy in step with accuracy, and the accuracy lost under privacy fell mainly on meningioma and</w:t>
-      </w:r>
-      <w:r>
-        <w:t xml:space="preserve"> </w:t>
-      </w:r>
-      <w:r>
-        <w:t xml:space="preserve">no-tumour sensitivity.</w:t>
+        <w:t xml:space="preserve">. With non-members matched to members by source and class, a likelihood-ratio membership attack</w:t>
+      </w:r>
+      <w:r>
+        <w:t xml:space="preserve"> </w:t>
+      </w:r>
+      <w:r>
+        <w:t xml:space="preserve">found 11.1% of training images at a 1% false-positive rate without privacy and 1.0% to 1.5% under record-level</w:t>
+      </w:r>
+      <w:r>
+        <w:t xml:space="preserve"> </w:t>
+      </w:r>
+      <w:r>
+        <w:t xml:space="preserve">privacy, not significantly above chance. An unclipped noise mechanism used in prior work still exposed training</w:t>
+      </w:r>
+      <w:r>
+        <w:t xml:space="preserve"> </w:t>
+      </w:r>
+      <w:r>
+        <w:t xml:space="preserve">patients (area under the curve 0.745). Grad-CAM localisation and cross-seed consistency declined in step with accuracy.</w:t>
       </w:r>
     </w:p>
     <w:p>
@@ -240,29 +246,42 @@
         <w:t xml:space="preserve"> </w:t>
       </w:r>
       <w:r>
-        <w:t xml:space="preserve">the submission. The authors declare no competing interests, and the work received no specific funding. Code, frozen</w:t>
-      </w:r>
-      <w:r>
-        <w:t xml:space="preserve"> </w:t>
-      </w:r>
-      <w:r>
-        <w:t xml:space="preserve">results and figure data are available in a public repository [CHECK: repository visibility and archive DOI].</w:t>
+        <w:t xml:space="preserve">the submission. The authors declare no competing interests, and the work received no specific funding. The study used</w:t>
+      </w:r>
+      <w:r>
+        <w:t xml:space="preserve"> </w:t>
+      </w:r>
+      <w:r>
+        <w:t xml:space="preserve">only public, de-identified images. Code, frozen results and figure data are available at</w:t>
+      </w:r>
+      <w:r>
+        <w:t xml:space="preserve"> </w:t>
+      </w:r>
+      <w:hyperlink r:id="rId20">
+        <w:r>
+          <w:rPr>
+            <w:rStyle w:val="Hyperlink"/>
+          </w:rPr>
+          <w:t xml:space="preserve">https://github.com/shashiranjan-jnu/dpfl-braintumor</w:t>
+        </w:r>
+      </w:hyperlink>
+      <w:r>
+        <w:t xml:space="preserve">, archived under DOI</w:t>
       </w:r>
     </w:p>
     <w:p>
-      <w:pPr>
-        <w:pStyle w:val="BodyText"/>
-      </w:pPr>
-      <w:r>
-        <w:t xml:space="preserve">Two potential reviewers are suggested in the submission system [CHECK: names, institutional e-mail addresses, no conflicts].</w:t>
+      <w:r>
+        <w:pict>
+          <v:rect style="width:0;height:1.5pt" o:hralign="center" o:hrstd="t" o:hr="t"/>
+        </w:pict>
       </w:r>
     </w:p>
     <w:p>
       <w:pPr>
-        <w:pStyle w:val="BodyText"/>
-      </w:pPr>
-      <w:r>
-        <w:t xml:space="preserve">Yours sincerely,</w:t>
+        <w:pStyle w:val="FirstParagraph"/>
+      </w:pPr>
+      <w:r>
+        <w:t xml:space="preserve">.</w:t>
       </w:r>
     </w:p>
     <w:p>
@@ -270,24 +289,277 @@
         <w:pStyle w:val="BodyText"/>
       </w:pPr>
       <w:r>
-        <w:t xml:space="preserve">Poonguzhali N (corresponding author)</w:t>
-      </w:r>
-      <w:r>
-        <w:br/>
-      </w:r>
-      <w:r>
-        <w:t xml:space="preserve">School of Computer and Systems Sciences, Jawaharlal Nehru University, New Delhi 110067, India</w:t>
-      </w:r>
-      <w:r>
-        <w:br/>
-      </w:r>
-      <w:r>
-        <w:t xml:space="preserve">poonguzhali@jnu.ac.in, telephone [CHECK]</w:t>
+        <w:t xml:space="preserve">Suggested reviewers, with no collaboration with the authors in the past five years:</w:t>
+      </w:r>
+    </w:p>
+    <w:tbl>
+      <w:tblPr>
+        <w:tblStyle w:val="Table"/>
+        <w:tblW w:type="auto" w:w="0"/>
+        <w:tblLook w:firstRow="1" w:lastRow="0" w:firstColumn="0" w:lastColumn="0" w:noHBand="0" w:noVBand="0" w:val="0020"/>
+        <w:jc w:val="start"/>
+      </w:tblPr>
+      <w:tblGrid>
+        <w:gridCol w:w="1584"/>
+        <w:gridCol w:w="1584"/>
+        <w:gridCol w:w="1584"/>
+        <w:gridCol w:w="1584"/>
+        <w:gridCol w:w="1584"/>
+      </w:tblGrid>
+      <w:tr>
+        <w:trPr>
+          <w:tblHeader w:val="true"/>
+        </w:trPr>
+        <w:tc>
+          <w:tcPr/>
+          <w:p>
+            <w:pPr>
+              <w:pStyle w:val="Compact"/>
+            </w:pPr>
+          </w:p>
+        </w:tc>
+        <w:tc>
+          <w:tcPr/>
+          <w:p>
+            <w:pPr>
+              <w:pStyle w:val="Compact"/>
+              <w:jc w:val="left"/>
+            </w:pPr>
+            <w:r>
+              <w:rPr>
+                <w:bCs/>
+                <w:b/>
+              </w:rPr>
+              <w:t xml:space="preserve">Name</w:t>
+            </w:r>
+          </w:p>
+        </w:tc>
+        <w:tc>
+          <w:tcPr/>
+          <w:p>
+            <w:pPr>
+              <w:pStyle w:val="Compact"/>
+              <w:jc w:val="left"/>
+            </w:pPr>
+            <w:r>
+              <w:rPr>
+                <w:bCs/>
+                <w:b/>
+              </w:rPr>
+              <w:t xml:space="preserve">Affiliation</w:t>
+            </w:r>
+          </w:p>
+        </w:tc>
+        <w:tc>
+          <w:tcPr/>
+          <w:p>
+            <w:pPr>
+              <w:pStyle w:val="Compact"/>
+              <w:jc w:val="left"/>
+            </w:pPr>
+            <w:r>
+              <w:rPr>
+                <w:bCs/>
+                <w:b/>
+              </w:rPr>
+              <w:t xml:space="preserve">Institutional e-mail</w:t>
+            </w:r>
+          </w:p>
+        </w:tc>
+        <w:tc>
+          <w:tcPr/>
+          <w:p>
+            <w:pPr>
+              <w:pStyle w:val="Compact"/>
+              <w:jc w:val="left"/>
+            </w:pPr>
+            <w:r>
+              <w:rPr>
+                <w:bCs/>
+                <w:b/>
+              </w:rPr>
+              <w:t xml:space="preserve">Expertise</w:t>
+            </w:r>
+          </w:p>
+        </w:tc>
+      </w:tr>
+      <w:tr>
+        <w:tc>
+          <w:tcPr/>
+          <w:p>
+            <w:pPr>
+              <w:pStyle w:val="Compact"/>
+              <w:jc w:val="left"/>
+            </w:pPr>
+            <w:r>
+              <w:t xml:space="preserve">1</w:t>
+            </w:r>
+          </w:p>
+        </w:tc>
+        <w:tc>
+          <w:tcPr/>
+          <w:p>
+            <w:pPr>
+              <w:pStyle w:val="Compact"/>
+            </w:pPr>
+          </w:p>
+        </w:tc>
+        <w:tc>
+          <w:tcPr/>
+          <w:p>
+            <w:pPr>
+              <w:pStyle w:val="Compact"/>
+            </w:pPr>
+          </w:p>
+        </w:tc>
+        <w:tc>
+          <w:tcPr/>
+          <w:p>
+            <w:pPr>
+              <w:pStyle w:val="Compact"/>
+            </w:pPr>
+          </w:p>
+        </w:tc>
+        <w:tc>
+          <w:tcPr/>
+          <w:p>
+            <w:pPr>
+              <w:pStyle w:val="Compact"/>
+            </w:pPr>
+          </w:p>
+        </w:tc>
+      </w:tr>
+      <w:tr>
+        <w:tc>
+          <w:tcPr/>
+          <w:p>
+            <w:pPr>
+              <w:pStyle w:val="Compact"/>
+              <w:jc w:val="left"/>
+            </w:pPr>
+            <w:r>
+              <w:t xml:space="preserve">2</w:t>
+            </w:r>
+          </w:p>
+        </w:tc>
+        <w:tc>
+          <w:tcPr/>
+          <w:p>
+            <w:pPr>
+              <w:pStyle w:val="Compact"/>
+            </w:pPr>
+          </w:p>
+        </w:tc>
+        <w:tc>
+          <w:tcPr/>
+          <w:p>
+            <w:pPr>
+              <w:pStyle w:val="Compact"/>
+            </w:pPr>
+          </w:p>
+        </w:tc>
+        <w:tc>
+          <w:tcPr/>
+          <w:p>
+            <w:pPr>
+              <w:pStyle w:val="Compact"/>
+            </w:pPr>
+          </w:p>
+        </w:tc>
+        <w:tc>
+          <w:tcPr/>
+          <w:p>
+            <w:pPr>
+              <w:pStyle w:val="Compact"/>
+            </w:pPr>
+          </w:p>
+        </w:tc>
+      </w:tr>
+      <w:tr>
+        <w:tc>
+          <w:tcPr/>
+          <w:p>
+            <w:pPr>
+              <w:pStyle w:val="Compact"/>
+              <w:jc w:val="left"/>
+            </w:pPr>
+            <w:r>
+              <w:t xml:space="preserve">3</w:t>
+            </w:r>
+          </w:p>
+        </w:tc>
+        <w:tc>
+          <w:tcPr/>
+          <w:p>
+            <w:pPr>
+              <w:pStyle w:val="Compact"/>
+            </w:pPr>
+          </w:p>
+        </w:tc>
+        <w:tc>
+          <w:tcPr/>
+          <w:p>
+            <w:pPr>
+              <w:pStyle w:val="Compact"/>
+            </w:pPr>
+          </w:p>
+        </w:tc>
+        <w:tc>
+          <w:tcPr/>
+          <w:p>
+            <w:pPr>
+              <w:pStyle w:val="Compact"/>
+            </w:pPr>
+          </w:p>
+        </w:tc>
+        <w:tc>
+          <w:tcPr/>
+          <w:p>
+            <w:pPr>
+              <w:pStyle w:val="Compact"/>
+            </w:pPr>
+          </w:p>
+        </w:tc>
+      </w:tr>
+    </w:tbl>
+    <w:p>
+      <w:pPr>
+        <w:pStyle w:val="BodyText"/>
+      </w:pPr>
+      <w:r>
+        <w:t xml:space="preserve">Yours sincerely,</w:t>
       </w:r>
     </w:p>
     <w:p>
       <w:pPr>
         <w:pStyle w:val="BodyText"/>
+      </w:pPr>
+      <w:r>
+        <w:t xml:space="preserve">Poonguzhali N (corresponding author)</w:t>
+      </w:r>
+      <w:r>
+        <w:br/>
+      </w:r>
+      <w:r>
+        <w:t xml:space="preserve">School of Computer and Systems Sciences, Jawaharlal Nehru University, New Delhi 110067, India</w:t>
+      </w:r>
+      <w:r>
+        <w:br/>
+      </w:r>
+      <w:r>
+        <w:t xml:space="preserve">poonguzhali@jnu.ac.in, telephone</w:t>
+      </w:r>
+    </w:p>
+    <w:p>
+      <w:r>
+        <w:pict>
+          <v:rect style="width:0;height:1.5pt" o:hralign="center" o:hrstd="t" o:hr="t"/>
+        </w:pict>
+      </w:r>
+    </w:p>
+    <w:p>
+      <w:pPr>
+        <w:pStyle w:val="FirstParagraph"/>
       </w:pPr>
       <w:r>
         <w:t xml:space="preserve">On behalf of Shashi Ranjan and Poonguzhali N</w:t>

</xml_diff>

<commit_message>
Cite Zenodo archive doi:10.5281/zenodo.23601090 (D63)
Co-Authored-By: Claude Opus 5.5 <noreply@anthropic.com>
Claude-Session: https://claude.ai/code/session_01GmqQpV3GfnfDawN9ZdytqY
</commit_message>
<xml_diff>
--- a/paper/submission/cover_letter.docx
+++ b/paper/submission/cover_letter.docx
@@ -266,22 +266,7 @@
         </w:r>
       </w:hyperlink>
       <w:r>
-        <w:t xml:space="preserve">, archived under DOI</w:t>
-      </w:r>
-    </w:p>
-    <w:p>
-      <w:r>
-        <w:pict>
-          <v:rect style="width:0;height:1.5pt" o:hralign="center" o:hrstd="t" o:hr="t"/>
-        </w:pict>
-      </w:r>
-    </w:p>
-    <w:p>
-      <w:pPr>
-        <w:pStyle w:val="FirstParagraph"/>
-      </w:pPr>
-      <w:r>
-        <w:t xml:space="preserve">.</w:t>
+        <w:t xml:space="preserve">, archived on Zenodo under doi:10.5281/zenodo.23601090.</w:t>
       </w:r>
     </w:p>
     <w:p>

</xml_diff>

<commit_message>
Clickable DOI links in manuscript, supplement and cover letter
Co-Authored-By: Claude Opus 5.5 <noreply@anthropic.com>
Claude-Session: https://claude.ai/code/session_01GmqQpV3GfnfDawN9ZdytqY
</commit_message>
<xml_diff>
--- a/paper/submission/cover_letter.docx
+++ b/paper/submission/cover_letter.docx
@@ -202,13 +202,41 @@
         <w:t xml:space="preserve"> </w:t>
       </w:r>
       <w:r>
-        <w:t xml:space="preserve">(Intell Oncol 2026;2(3):100071, doi:10.1016/j.intonc.2026.100071), and Jung et al. applied deep learning to small</w:t>
-      </w:r>
-      <w:r>
-        <w:t xml:space="preserve"> </w:t>
-      </w:r>
-      <w:r>
-        <w:t xml:space="preserve">brain metastases (Intell Oncol 2026;2(2):100049, doi:10.1016/j.intonc.2026.100049). Li et al. reviewed</w:t>
+        <w:t xml:space="preserve">(Intell Oncol 2026;2(3):100071,</w:t>
+      </w:r>
+      <w:r>
+        <w:t xml:space="preserve"> </w:t>
+      </w:r>
+      <w:hyperlink r:id="rId20">
+        <w:r>
+          <w:rPr>
+            <w:rStyle w:val="Hyperlink"/>
+          </w:rPr>
+          <w:t xml:space="preserve">doi:10.1016/j.intonc.2026.100071</w:t>
+        </w:r>
+      </w:hyperlink>
+      <w:r>
+        <w:t xml:space="preserve">), and Jung et al. applied deep learning to small</w:t>
+      </w:r>
+      <w:r>
+        <w:t xml:space="preserve"> </w:t>
+      </w:r>
+      <w:r>
+        <w:t xml:space="preserve">brain metastases (Intell Oncol 2026;2(2):100049,</w:t>
+      </w:r>
+      <w:r>
+        <w:t xml:space="preserve"> </w:t>
+      </w:r>
+      <w:hyperlink r:id="rId21">
+        <w:r>
+          <w:rPr>
+            <w:rStyle w:val="Hyperlink"/>
+          </w:rPr>
+          <w:t xml:space="preserve">doi:10.1016/j.intonc.2026.100049</w:t>
+        </w:r>
+      </w:hyperlink>
+      <w:r>
+        <w:t xml:space="preserve">). Li et al. reviewed</w:t>
       </w:r>
       <w:r>
         <w:t xml:space="preserve"> </w:t>
@@ -219,14 +247,36 @@
       <w:r>
         <w:t xml:space="preserve"> </w:t>
       </w:r>
-      <w:r>
-        <w:t xml:space="preserve">doi:10.1016/j.intonc.2026.100083), and Cai discussed transparency and privacy preservation in medical artificial</w:t>
-      </w:r>
-      <w:r>
-        <w:t xml:space="preserve"> </w:t>
-      </w:r>
-      <w:r>
-        <w:t xml:space="preserve">intelligence (Intell Oncol 2025;1(2):172-175, doi:10.1016/j.intonc.2025.03.006). The manuscript complements these</w:t>
+      <w:hyperlink r:id="rId22">
+        <w:r>
+          <w:rPr>
+            <w:rStyle w:val="Hyperlink"/>
+          </w:rPr>
+          <w:t xml:space="preserve">doi:10.1016/j.intonc.2026.100083</w:t>
+        </w:r>
+      </w:hyperlink>
+      <w:r>
+        <w:t xml:space="preserve">), and Cai discussed transparency and privacy preservation in medical artificial</w:t>
+      </w:r>
+      <w:r>
+        <w:t xml:space="preserve"> </w:t>
+      </w:r>
+      <w:r>
+        <w:t xml:space="preserve">intelligence (Intell Oncol 2025;1(2):172-175,</w:t>
+      </w:r>
+      <w:r>
+        <w:t xml:space="preserve"> </w:t>
+      </w:r>
+      <w:hyperlink r:id="rId23">
+        <w:r>
+          <w:rPr>
+            <w:rStyle w:val="Hyperlink"/>
+          </w:rPr>
+          <w:t xml:space="preserve">doi:10.1016/j.intonc.2025.03.006</w:t>
+        </w:r>
+      </w:hyperlink>
+      <w:r>
+        <w:t xml:space="preserve">). The manuscript complements these</w:t>
       </w:r>
       <w:r>
         <w:t xml:space="preserve"> </w:t>
@@ -257,7 +307,7 @@
       <w:r>
         <w:t xml:space="preserve"> </w:t>
       </w:r>
-      <w:hyperlink r:id="rId20">
+      <w:hyperlink r:id="rId24">
         <w:r>
           <w:rPr>
             <w:rStyle w:val="Hyperlink"/>
@@ -266,7 +316,21 @@
         </w:r>
       </w:hyperlink>
       <w:r>
-        <w:t xml:space="preserve">, archived on Zenodo under doi:10.5281/zenodo.23601090.</w:t>
+        <w:t xml:space="preserve">, archived on Zenodo under</w:t>
+      </w:r>
+      <w:r>
+        <w:t xml:space="preserve"> </w:t>
+      </w:r>
+      <w:hyperlink r:id="rId25">
+        <w:r>
+          <w:rPr>
+            <w:rStyle w:val="Hyperlink"/>
+          </w:rPr>
+          <w:t xml:space="preserve">doi:10.5281/zenodo.23601090</w:t>
+        </w:r>
+      </w:hyperlink>
+      <w:r>
+        <w:t xml:space="preserve">.</w:t>
       </w:r>
     </w:p>
     <w:p>

</xml_diff>